<commit_message>
OpenAI GPT-4o to Claude AI for LLM tasks, including detailed changes in task descriptions, status updates, and migration steps. Revise definitions, ordered task lists, and priority summaries to align with new AI provider integration and workflow adjustments.
</commit_message>
<xml_diff>
--- a/work_reports/Week5_Task_Plan.docx
+++ b/work_reports/Week5_Task_Plan.docx
@@ -3,9 +3,6 @@
 <w:document xmlns:wpc="http://schemas.microsoft.com/office/word/2010/wordprocessingCanvas" xmlns:mo="http://schemas.microsoft.com/office/mac/office/2008/main" xmlns:mc="http://schemas.openxmlformats.org/markup-compatibility/2006" xmlns:mv="urn:schemas-microsoft-com:mac:vml" xmlns:o="urn:schemas-microsoft-com:office:office" xmlns:r="http://schemas.openxmlformats.org/officeDocument/2006/relationships" xmlns:m="http://schemas.openxmlformats.org/officeDocument/2006/math" xmlns:v="urn:schemas-microsoft-com:vml" xmlns:wp14="http://schemas.microsoft.com/office/word/2010/wordprocessingDrawing" xmlns:wp="http://schemas.openxmlformats.org/drawingml/2006/wordprocessingDrawing" xmlns:w10="urn:schemas-microsoft-com:office:word" xmlns:w="http://schemas.openxmlformats.org/wordprocessingml/2006/main" xmlns:w14="http://schemas.microsoft.com/office/word/2010/wordml" xmlns:wpg="http://schemas.microsoft.com/office/word/2010/wordprocessingGroup" xmlns:wpi="http://schemas.microsoft.com/office/word/2010/wordprocessingInk" xmlns:wne="http://schemas.microsoft.com/office/word/2006/wordml" xmlns:wps="http://schemas.microsoft.com/office/word/2010/wordprocessingShape" mc:Ignorable="w14 wp14">
   <w:body>
     <w:p>
-      <w:pPr>
-        <w:jc w:val="left"/>
-      </w:pPr>
       <w:r>
         <w:rPr>
           <w:b/>
@@ -108,6 +105,215 @@
           <w:color w:val="C9A84C"/>
           <w:sz w:val="26"/>
         </w:rPr>
+        <w:t>AI PROVIDER DECISION</w:t>
+      </w:r>
+    </w:p>
+    <w:p>
+      <w:r>
+        <w:rPr>
+          <w:b/>
+          <w:sz w:val="20"/>
+        </w:rPr>
+        <w:t>Claude AI (Anthropic) replaces OpenAI GPT-4o</w:t>
+      </w:r>
+      <w:r>
+        <w:rPr>
+          <w:sz w:val="20"/>
+        </w:rPr>
+        <w:t xml:space="preserve"> for all LLM tasks:</w:t>
+      </w:r>
+    </w:p>
+    <w:p>
+      <w:pPr>
+        <w:pStyle w:val="ListBullet"/>
+        <w:ind w:left="360"/>
+      </w:pPr>
+      <w:r>
+        <w:rPr>
+          <w:sz w:val="20"/>
+        </w:rPr>
+        <w:t>Classification (P2), draft generation (P1/P3/P5), lead extraction (P4), tone validation (P6)</w:t>
+      </w:r>
+    </w:p>
+    <w:p>
+      <w:pPr>
+        <w:pStyle w:val="ListBullet"/>
+        <w:ind w:left="360"/>
+      </w:pPr>
+      <w:r>
+        <w:rPr>
+          <w:sz w:val="20"/>
+        </w:rPr>
+        <w:t xml:space="preserve">Package: </w:t>
+      </w:r>
+      <w:r>
+        <w:rPr>
+          <w:rFonts w:ascii="Courier New" w:hAnsi="Courier New"/>
+          <w:color w:val="C7254F"/>
+          <w:sz w:val="20"/>
+        </w:rPr>
+        <w:t>@anthropic-ai/sdk</w:t>
+      </w:r>
+      <w:r>
+        <w:rPr>
+          <w:sz w:val="20"/>
+        </w:rPr>
+        <w:t xml:space="preserve"> · Models: </w:t>
+      </w:r>
+      <w:r>
+        <w:rPr>
+          <w:rFonts w:ascii="Courier New" w:hAnsi="Courier New"/>
+          <w:color w:val="C7254F"/>
+          <w:sz w:val="20"/>
+        </w:rPr>
+        <w:t>claude-sonnet-4-6</w:t>
+      </w:r>
+      <w:r>
+        <w:rPr>
+          <w:sz w:val="20"/>
+        </w:rPr>
+        <w:t xml:space="preserve"> (classify/draft), </w:t>
+      </w:r>
+      <w:r>
+        <w:rPr>
+          <w:rFonts w:ascii="Courier New" w:hAnsi="Courier New"/>
+          <w:color w:val="C7254F"/>
+          <w:sz w:val="20"/>
+        </w:rPr>
+        <w:t>claude-haiku-4-5-20251001</w:t>
+      </w:r>
+      <w:r>
+        <w:rPr>
+          <w:sz w:val="20"/>
+        </w:rPr>
+        <w:t xml:space="preserve"> (tone validation)</w:t>
+      </w:r>
+    </w:p>
+    <w:p>
+      <w:pPr>
+        <w:pStyle w:val="ListBullet"/>
+        <w:ind w:left="360"/>
+      </w:pPr>
+      <w:r>
+        <w:rPr>
+          <w:b/>
+          <w:sz w:val="20"/>
+        </w:rPr>
+        <w:t>Embeddings exception</w:t>
+      </w:r>
+      <w:r>
+        <w:rPr>
+          <w:sz w:val="20"/>
+        </w:rPr>
+        <w:t xml:space="preserve">: Anthropic has no embeddings API. OpenAI </w:t>
+      </w:r>
+      <w:r>
+        <w:rPr>
+          <w:rFonts w:ascii="Courier New" w:hAnsi="Courier New"/>
+          <w:color w:val="C7254F"/>
+          <w:sz w:val="20"/>
+        </w:rPr>
+        <w:t>text-embedding-3-small</w:t>
+      </w:r>
+      <w:r>
+        <w:rPr>
+          <w:sz w:val="20"/>
+        </w:rPr>
+        <w:t xml:space="preserve"> (1536-dim) is kept </w:t>
+      </w:r>
+      <w:r>
+        <w:rPr>
+          <w:b/>
+          <w:sz w:val="20"/>
+        </w:rPr>
+        <w:t>only</w:t>
+      </w:r>
+      <w:r>
+        <w:rPr>
+          <w:sz w:val="20"/>
+        </w:rPr>
+        <w:t xml:space="preserve"> for Pinecone vector embeddings. Alternatively, Voyage AI (</w:t>
+      </w:r>
+      <w:r>
+        <w:rPr>
+          <w:rFonts w:ascii="Courier New" w:hAnsi="Courier New"/>
+          <w:color w:val="C7254F"/>
+          <w:sz w:val="20"/>
+        </w:rPr>
+        <w:t>voyage-3</w:t>
+      </w:r>
+      <w:r>
+        <w:rPr>
+          <w:sz w:val="20"/>
+        </w:rPr>
+        <w:t>) can replace this in a future sprint but requires recreating the Pinecone index at 1024 dims.</w:t>
+      </w:r>
+    </w:p>
+    <w:p>
+      <w:pPr>
+        <w:pStyle w:val="ListBullet"/>
+        <w:ind w:left="360"/>
+      </w:pPr>
+      <w:r>
+        <w:rPr>
+          <w:rFonts w:ascii="Courier New" w:hAnsi="Courier New"/>
+          <w:color w:val="C7254F"/>
+          <w:sz w:val="20"/>
+        </w:rPr>
+        <w:t>ANTHROPIC_API_KEY</w:t>
+      </w:r>
+      <w:r>
+        <w:rPr>
+          <w:sz w:val="20"/>
+        </w:rPr>
+        <w:t xml:space="preserve"> added to </w:t>
+      </w:r>
+      <w:r>
+        <w:rPr>
+          <w:rFonts w:ascii="Courier New" w:hAnsi="Courier New"/>
+          <w:color w:val="C7254F"/>
+          <w:sz w:val="20"/>
+        </w:rPr>
+        <w:t>.env.example</w:t>
+      </w:r>
+      <w:r>
+        <w:rPr>
+          <w:sz w:val="20"/>
+        </w:rPr>
+        <w:t xml:space="preserve">. </w:t>
+      </w:r>
+      <w:r>
+        <w:rPr>
+          <w:rFonts w:ascii="Courier New" w:hAnsi="Courier New"/>
+          <w:color w:val="C7254F"/>
+          <w:sz w:val="20"/>
+        </w:rPr>
+        <w:t>OPENAI_API_KEY</w:t>
+      </w:r>
+      <w:r>
+        <w:rPr>
+          <w:sz w:val="20"/>
+        </w:rPr>
+        <w:t xml:space="preserve"> remains for embeddings only.</w:t>
+      </w:r>
+    </w:p>
+    <w:p>
+      <w:r>
+        <w:rPr>
+          <w:color w:val="DDDDDD"/>
+          <w:sz w:val="16"/>
+        </w:rPr>
+        <w:t>────────────────────────────────────────────────────────────────────────────────</w:t>
+      </w:r>
+    </w:p>
+    <w:p/>
+    <w:p>
+      <w:r>
+        <w:rPr>
+          <w:b/>
+          <w:color w:val="C9A84C"/>
+          <w:sz w:val="26"/>
+        </w:rPr>
         <w:t>DEFINITION OF "GMAIL FULL WORKFLOW DONE"</w:t>
       </w:r>
     </w:p>
@@ -116,7 +322,7 @@
         <w:rPr>
           <w:sz w:val="20"/>
         </w:rPr>
-        <w:t>A real email arrives at the DPW Gmail inbox → ingested → classified by GPT-4o → context retrieved from Pinecone → draft generated with correct sender persona, sanitizers passed → team approves via dashboard → reply sent back into the original Gmail thread with the correct subject, sender, and signature.</w:t>
+        <w:t>A real email arrives at the DPW Gmail inbox → ingested → classified by Claude Sonnet → context retrieved from Pinecone → draft generated with correct sender persona, sanitizers passed → team approves via dashboard → reply sent back into the original Gmail thread with the correct subject, sender, and signature.</w:t>
       </w:r>
     </w:p>
     <w:p>
@@ -542,13 +748,15 @@
           <w:sz w:val="22"/>
           <w:u w:val="single"/>
         </w:rPr>
-        <w:t>DAY 1 — Monday 2026-05-04 (Today)</w:t>
+        <w:t>DAY 1 — Monday 2026-05-04 ✅ COMPLETE</w:t>
       </w:r>
     </w:p>
     <w:p>
       <w:r>
         <w:rPr>
           <w:b/>
+          <w:i/>
+          <w:color w:val="444444"/>
           <w:sz w:val="20"/>
         </w:rPr>
         <w:t>Goal: Clean foundation — schema correct, DB seeded, backend secured</w:t>
@@ -639,7 +847,7 @@
                 <w:color w:val="1A1A2E"/>
                 <w:sz w:val="18"/>
               </w:rPr>
-              <w:t>Source Ref</w:t>
+              <w:t>Status</w:t>
             </w:r>
           </w:p>
         </w:tc>
@@ -664,7 +872,7 @@
                 <w:color w:val="1A1A2E"/>
                 <w:sz w:val="18"/>
               </w:rPr>
-              <w:t>Key Actions</w:t>
+              <w:t>What Was Done</w:t>
             </w:r>
           </w:p>
         </w:tc>
@@ -735,7 +943,7 @@
               <w:rPr>
                 <w:sz w:val="18"/>
               </w:rPr>
-              <w:t>SONNET Task 1</w:t>
+              <w:t>✅ Done</w:t>
             </w:r>
           </w:p>
         </w:tc>
@@ -760,13 +968,13 @@
                 <w:color w:val="C7254F"/>
                 <w:sz w:val="18"/>
               </w:rPr>
-              <w:t>backend/src/routes/drafts.ts</w:t>
-            </w:r>
-            <w:r>
-              <w:rPr>
-                <w:sz w:val="18"/>
-              </w:rPr>
-              <w:t xml:space="preserve">: rename </w:t>
+              <w:t>drafts.ts</w:t>
+            </w:r>
+            <w:r>
+              <w:rPr>
+                <w:sz w:val="18"/>
+              </w:rPr>
+              <w:t xml:space="preserve">: </w:t>
             </w:r>
             <w:r>
               <w:rPr>
@@ -794,7 +1002,7 @@
               <w:rPr>
                 <w:sz w:val="18"/>
               </w:rPr>
-              <w:t xml:space="preserve">. </w:t>
+              <w:t xml:space="preserve"> (schema + handler). </w:t>
             </w:r>
             <w:r>
               <w:rPr>
@@ -802,13 +1010,13 @@
                 <w:color w:val="C7254F"/>
                 <w:sz w:val="18"/>
               </w:rPr>
-              <w:t>backend/src/routes/webhooks.ts</w:t>
-            </w:r>
-            <w:r>
-              <w:rPr>
-                <w:sz w:val="18"/>
-              </w:rPr>
-              <w:t xml:space="preserve">: rename </w:t>
+              <w:t>webhooks.ts</w:t>
+            </w:r>
+            <w:r>
+              <w:rPr>
+                <w:sz w:val="18"/>
+              </w:rPr>
+              <w:t xml:space="preserve">: </w:t>
             </w:r>
             <w:r>
               <w:rPr>
@@ -836,7 +1044,7 @@
               <w:rPr>
                 <w:sz w:val="18"/>
               </w:rPr>
-              <w:t>; fix leads fields (</w:t>
+              <w:t xml:space="preserve"> + added </w:t>
             </w:r>
             <w:r>
               <w:rPr>
@@ -844,13 +1052,13 @@
                 <w:color w:val="C7254F"/>
                 <w:sz w:val="18"/>
               </w:rPr>
-              <w:t>client_name</w:t>
-            </w:r>
-            <w:r>
-              <w:rPr>
-                <w:sz w:val="18"/>
-              </w:rPr>
-              <w:t>→</w:t>
+              <w:t>classification_reasoning</w:t>
+            </w:r>
+            <w:r>
+              <w:rPr>
+                <w:sz w:val="18"/>
+              </w:rPr>
+              <w:t>; lead fields renamed (</w:t>
             </w:r>
             <w:r>
               <w:rPr>
@@ -858,13 +1066,13 @@
                 <w:color w:val="C7254F"/>
                 <w:sz w:val="18"/>
               </w:rPr>
-              <w:t>client_names[]</w:t>
-            </w:r>
-            <w:r>
-              <w:rPr>
-                <w:sz w:val="18"/>
-              </w:rPr>
-              <w:t xml:space="preserve">, </w:t>
+              <w:t>client_name</w:t>
+            </w:r>
+            <w:r>
+              <w:rPr>
+                <w:sz w:val="18"/>
+              </w:rPr>
+              <w:t>→</w:t>
             </w:r>
             <w:r>
               <w:rPr>
@@ -872,13 +1080,13 @@
                 <w:color w:val="C7254F"/>
                 <w:sz w:val="18"/>
               </w:rPr>
-              <w:t>client_email</w:t>
-            </w:r>
-            <w:r>
-              <w:rPr>
-                <w:sz w:val="18"/>
-              </w:rPr>
-              <w:t>→</w:t>
+              <w:t>client_names[]</w:t>
+            </w:r>
+            <w:r>
+              <w:rPr>
+                <w:sz w:val="18"/>
+              </w:rPr>
+              <w:t xml:space="preserve">, </w:t>
             </w:r>
             <w:r>
               <w:rPr>
@@ -886,13 +1094,13 @@
                 <w:color w:val="C7254F"/>
                 <w:sz w:val="18"/>
               </w:rPr>
-              <w:t>email</w:t>
-            </w:r>
-            <w:r>
-              <w:rPr>
-                <w:sz w:val="18"/>
-              </w:rPr>
-              <w:t xml:space="preserve">, </w:t>
+              <w:t>client_email</w:t>
+            </w:r>
+            <w:r>
+              <w:rPr>
+                <w:sz w:val="18"/>
+              </w:rPr>
+              <w:t>→</w:t>
             </w:r>
             <w:r>
               <w:rPr>
@@ -900,13 +1108,13 @@
                 <w:color w:val="C7254F"/>
                 <w:sz w:val="18"/>
               </w:rPr>
-              <w:t>client_phone</w:t>
-            </w:r>
-            <w:r>
-              <w:rPr>
-                <w:sz w:val="18"/>
-              </w:rPr>
-              <w:t>→</w:t>
+              <w:t>email</w:t>
+            </w:r>
+            <w:r>
+              <w:rPr>
+                <w:sz w:val="18"/>
+              </w:rPr>
+              <w:t xml:space="preserve">, </w:t>
             </w:r>
             <w:r>
               <w:rPr>
@@ -914,13 +1122,13 @@
                 <w:color w:val="C7254F"/>
                 <w:sz w:val="18"/>
               </w:rPr>
-              <w:t>phone</w:t>
-            </w:r>
-            <w:r>
-              <w:rPr>
-                <w:sz w:val="18"/>
-              </w:rPr>
-              <w:t xml:space="preserve">, </w:t>
+              <w:t>client_phone</w:t>
+            </w:r>
+            <w:r>
+              <w:rPr>
+                <w:sz w:val="18"/>
+              </w:rPr>
+              <w:t>→</w:t>
             </w:r>
             <w:r>
               <w:rPr>
@@ -928,13 +1136,13 @@
                 <w:color w:val="C7254F"/>
                 <w:sz w:val="18"/>
               </w:rPr>
-              <w:t>source</w:t>
-            </w:r>
-            <w:r>
-              <w:rPr>
-                <w:sz w:val="18"/>
-              </w:rPr>
-              <w:t>→</w:t>
+              <w:t>phone</w:t>
+            </w:r>
+            <w:r>
+              <w:rPr>
+                <w:sz w:val="18"/>
+              </w:rPr>
+              <w:t xml:space="preserve">, </w:t>
             </w:r>
             <w:r>
               <w:rPr>
@@ -942,13 +1150,13 @@
                 <w:color w:val="C7254F"/>
                 <w:sz w:val="18"/>
               </w:rPr>
-              <w:t>source_channel</w:t>
-            </w:r>
-            <w:r>
-              <w:rPr>
-                <w:sz w:val="18"/>
-              </w:rPr>
-              <w:t xml:space="preserve">); rename </w:t>
+              <w:t>source</w:t>
+            </w:r>
+            <w:r>
+              <w:rPr>
+                <w:sz w:val="18"/>
+              </w:rPr>
+              <w:t>→</w:t>
             </w:r>
             <w:r>
               <w:rPr>
@@ -956,13 +1164,13 @@
                 <w:color w:val="C7254F"/>
                 <w:sz w:val="18"/>
               </w:rPr>
-              <w:t>errors_log.source</w:t>
-            </w:r>
-            <w:r>
-              <w:rPr>
-                <w:sz w:val="18"/>
-              </w:rPr>
-              <w:t>→</w:t>
+              <w:t>source_channel</w:t>
+            </w:r>
+            <w:r>
+              <w:rPr>
+                <w:sz w:val="18"/>
+              </w:rPr>
+              <w:t xml:space="preserve">); added </w:t>
             </w:r>
             <w:r>
               <w:rPr>
@@ -970,13 +1178,13 @@
                 <w:color w:val="C7254F"/>
                 <w:sz w:val="18"/>
               </w:rPr>
-              <w:t>workflow_name</w:t>
-            </w:r>
-            <w:r>
-              <w:rPr>
-                <w:sz w:val="18"/>
-              </w:rPr>
-              <w:t xml:space="preserve">. Run </w:t>
+              <w:t>location</w:t>
+            </w:r>
+            <w:r>
+              <w:rPr>
+                <w:sz w:val="18"/>
+              </w:rPr>
+              <w:t xml:space="preserve">, </w:t>
             </w:r>
             <w:r>
               <w:rPr>
@@ -984,13 +1192,69 @@
                 <w:color w:val="C7254F"/>
                 <w:sz w:val="18"/>
               </w:rPr>
-              <w:t>npm run build</w:t>
-            </w:r>
-            <w:r>
-              <w:rPr>
-                <w:sz w:val="18"/>
-              </w:rPr>
-              <w:t xml:space="preserve"> → must compile clean.</w:t>
+              <w:t>wedding_date_flexible</w:t>
+            </w:r>
+            <w:r>
+              <w:rPr>
+                <w:sz w:val="18"/>
+              </w:rPr>
+              <w:t xml:space="preserve">, </w:t>
+            </w:r>
+            <w:r>
+              <w:rPr>
+                <w:rFonts w:ascii="Courier New" w:hAnsi="Courier New"/>
+                <w:color w:val="C7254F"/>
+                <w:sz w:val="18"/>
+              </w:rPr>
+              <w:t>how_found_us</w:t>
+            </w:r>
+            <w:r>
+              <w:rPr>
+                <w:sz w:val="18"/>
+              </w:rPr>
+              <w:t xml:space="preserve">; </w:t>
+            </w:r>
+            <w:r>
+              <w:rPr>
+                <w:rFonts w:ascii="Courier New" w:hAnsi="Courier New"/>
+                <w:color w:val="C7254F"/>
+                <w:sz w:val="18"/>
+              </w:rPr>
+              <w:t>errors_log.source</w:t>
+            </w:r>
+            <w:r>
+              <w:rPr>
+                <w:sz w:val="18"/>
+              </w:rPr>
+              <w:t xml:space="preserve"> → </w:t>
+            </w:r>
+            <w:r>
+              <w:rPr>
+                <w:rFonts w:ascii="Courier New" w:hAnsi="Courier New"/>
+                <w:color w:val="C7254F"/>
+                <w:sz w:val="18"/>
+              </w:rPr>
+              <w:t>workflow_name</w:t>
+            </w:r>
+            <w:r>
+              <w:rPr>
+                <w:sz w:val="18"/>
+              </w:rPr>
+              <w:t xml:space="preserve">. </w:t>
+            </w:r>
+            <w:r>
+              <w:rPr>
+                <w:rFonts w:ascii="Courier New" w:hAnsi="Courier New"/>
+                <w:color w:val="C7254F"/>
+                <w:sz w:val="18"/>
+              </w:rPr>
+              <w:t>tsc --noEmit</w:t>
+            </w:r>
+            <w:r>
+              <w:rPr>
+                <w:sz w:val="18"/>
+              </w:rPr>
+              <w:t xml:space="preserve"> passes clean.</w:t>
             </w:r>
           </w:p>
         </w:tc>
@@ -1061,7 +1325,7 @@
               <w:rPr>
                 <w:sz w:val="18"/>
               </w:rPr>
-              <w:t>SONNET Task 2</w:t>
+              <w:t>✅ Done</w:t>
             </w:r>
           </w:p>
         </w:tc>
@@ -1082,23 +1346,17 @@
             </w:pPr>
             <w:r>
               <w:rPr>
-                <w:sz w:val="18"/>
-              </w:rPr>
-              <w:t xml:space="preserve">Create </w:t>
-            </w:r>
-            <w:r>
-              <w:rPr>
                 <w:rFonts w:ascii="Courier New" w:hAnsi="Courier New"/>
                 <w:color w:val="C7254F"/>
                 <w:sz w:val="18"/>
               </w:rPr>
-              <w:t>supabase/migrations/20260429000001_planning_step_and_signature.sql</w:t>
-            </w:r>
-            <w:r>
-              <w:rPr>
-                <w:sz w:val="18"/>
-              </w:rPr>
-              <w:t xml:space="preserve"> (adds </w:t>
+              <w:t>20260429000001_planning_step_and_signature.sql</w:t>
+            </w:r>
+            <w:r>
+              <w:rPr>
+                <w:sz w:val="18"/>
+              </w:rPr>
+              <w:t xml:space="preserve">: adds </w:t>
             </w:r>
             <w:r>
               <w:rPr>
@@ -1238,7 +1496,7 @@
               <w:rPr>
                 <w:sz w:val="18"/>
               </w:rPr>
-              <w:t xml:space="preserve"> table). Create </w:t>
+              <w:t xml:space="preserve"> table with RLS. </w:t>
             </w:r>
             <w:r>
               <w:rPr>
@@ -1246,13 +1504,13 @@
                 <w:color w:val="C7254F"/>
                 <w:sz w:val="18"/>
               </w:rPr>
-              <w:t>supabase/migrations/20260429000002_seed_brand_config.sql</w:t>
-            </w:r>
-            <w:r>
-              <w:rPr>
-                <w:sz w:val="18"/>
-              </w:rPr>
-              <w:t xml:space="preserve"> (seeds P1–P6 prompts, </w:t>
+              <w:t>20260429000002_seed_brand_config.sql</w:t>
+            </w:r>
+            <w:r>
+              <w:rPr>
+                <w:sz w:val="18"/>
+              </w:rPr>
+              <w:t xml:space="preserve">: seeds P1–P6 prompts, </w:t>
             </w:r>
             <w:r>
               <w:rPr>
@@ -1322,35 +1580,13 @@
               <w:rPr>
                 <w:sz w:val="18"/>
               </w:rPr>
-              <w:t xml:space="preserve">). Run </w:t>
-            </w:r>
-            <w:r>
-              <w:rPr>
-                <w:rFonts w:ascii="Courier New" w:hAnsi="Courier New"/>
-                <w:color w:val="C7254F"/>
-                <w:sz w:val="18"/>
-              </w:rPr>
-              <w:t>supabase db push</w:t>
-            </w:r>
-            <w:r>
-              <w:rPr>
-                <w:sz w:val="18"/>
-              </w:rPr>
-              <w:t xml:space="preserve">. Verify 15+ rows in </w:t>
-            </w:r>
-            <w:r>
-              <w:rPr>
-                <w:rFonts w:ascii="Courier New" w:hAnsi="Courier New"/>
-                <w:color w:val="C7254F"/>
-                <w:sz w:val="18"/>
-              </w:rPr>
-              <w:t>system_config</w:t>
-            </w:r>
-            <w:r>
-              <w:rPr>
-                <w:sz w:val="18"/>
-              </w:rPr>
-              <w:t>.</w:t>
+              <w:t xml:space="preserve">. </w:t>
+            </w:r>
+            <w:r>
+              <w:rPr>
+                <w:b/>
+              </w:rPr>
+              <w:t>Run `supabase db push` to apply.</w:t>
             </w:r>
           </w:p>
         </w:tc>
@@ -1421,7 +1657,7 @@
               <w:rPr>
                 <w:sz w:val="18"/>
               </w:rPr>
-              <w:t>SONNET Task 3</w:t>
+              <w:t>✅ Done</w:t>
             </w:r>
           </w:p>
         </w:tc>
@@ -1444,7 +1680,7 @@
               <w:rPr>
                 <w:sz w:val="18"/>
               </w:rPr>
-              <w:t xml:space="preserve">Create </w:t>
+              <w:t xml:space="preserve">Created </w:t>
             </w:r>
             <w:r>
               <w:rPr>
@@ -1486,7 +1722,7 @@
               <w:rPr>
                 <w:sz w:val="18"/>
               </w:rPr>
-              <w:t xml:space="preserve">). Create </w:t>
+              <w:t xml:space="preserve">). Created </w:t>
             </w:r>
             <w:r>
               <w:rPr>
@@ -1528,7 +1764,7 @@
               <w:rPr>
                 <w:sz w:val="18"/>
               </w:rPr>
-              <w:t xml:space="preserve">). Modify </w:t>
+              <w:t xml:space="preserve">). Updated </w:t>
             </w:r>
             <w:r>
               <w:rPr>
@@ -1536,13 +1772,13 @@
                 <w:color w:val="C7254F"/>
                 <w:sz w:val="18"/>
               </w:rPr>
-              <w:t>backend/src/index.ts</w:t>
-            </w:r>
-            <w:r>
-              <w:rPr>
-                <w:sz w:val="18"/>
-              </w:rPr>
-              <w:t xml:space="preserve">: apply </w:t>
+              <w:t>index.ts</w:t>
+            </w:r>
+            <w:r>
+              <w:rPr>
+                <w:sz w:val="18"/>
+              </w:rPr>
+              <w:t xml:space="preserve">: </w:t>
             </w:r>
             <w:r>
               <w:rPr>
@@ -1556,7 +1792,7 @@
               <w:rPr>
                 <w:sz w:val="18"/>
               </w:rPr>
-              <w:t xml:space="preserve"> to </w:t>
+              <w:t xml:space="preserve"> on messages/drafts/inboxes/leads; </w:t>
             </w:r>
             <w:r>
               <w:rPr>
@@ -1564,13 +1800,13 @@
                 <w:color w:val="C7254F"/>
                 <w:sz w:val="18"/>
               </w:rPr>
-              <w:t>/api/messages</w:t>
-            </w:r>
-            <w:r>
-              <w:rPr>
-                <w:sz w:val="18"/>
-              </w:rPr>
-              <w:t xml:space="preserve">, </w:t>
+              <w:t>requireHmac</w:t>
+            </w:r>
+            <w:r>
+              <w:rPr>
+                <w:sz w:val="18"/>
+              </w:rPr>
+              <w:t xml:space="preserve"> on webhooks; </w:t>
             </w:r>
             <w:r>
               <w:rPr>
@@ -1578,97 +1814,13 @@
                 <w:color w:val="C7254F"/>
                 <w:sz w:val="18"/>
               </w:rPr>
-              <w:t>/api/drafts</w:t>
-            </w:r>
-            <w:r>
-              <w:rPr>
-                <w:sz w:val="18"/>
-              </w:rPr>
-              <w:t xml:space="preserve">, </w:t>
-            </w:r>
-            <w:r>
-              <w:rPr>
-                <w:rFonts w:ascii="Courier New" w:hAnsi="Courier New"/>
-                <w:color w:val="C7254F"/>
-                <w:sz w:val="18"/>
-              </w:rPr>
-              <w:t>/api/leads</w:t>
-            </w:r>
-            <w:r>
-              <w:rPr>
-                <w:sz w:val="18"/>
-              </w:rPr>
-              <w:t xml:space="preserve">, </w:t>
-            </w:r>
-            <w:r>
-              <w:rPr>
-                <w:rFonts w:ascii="Courier New" w:hAnsi="Courier New"/>
-                <w:color w:val="C7254F"/>
-                <w:sz w:val="18"/>
-              </w:rPr>
-              <w:t>/api/inboxes</w:t>
-            </w:r>
-            <w:r>
-              <w:rPr>
-                <w:sz w:val="18"/>
-              </w:rPr>
-              <w:t xml:space="preserve">; apply </w:t>
-            </w:r>
-            <w:r>
-              <w:rPr>
-                <w:rFonts w:ascii="Courier New" w:hAnsi="Courier New"/>
-                <w:color w:val="C7254F"/>
-                <w:sz w:val="18"/>
-              </w:rPr>
-              <w:t>requireHmac</w:t>
-            </w:r>
-            <w:r>
-              <w:rPr>
-                <w:sz w:val="18"/>
-              </w:rPr>
-              <w:t xml:space="preserve"> to </w:t>
-            </w:r>
-            <w:r>
-              <w:rPr>
-                <w:rFonts w:ascii="Courier New" w:hAnsi="Courier New"/>
-                <w:color w:val="C7254F"/>
-                <w:sz w:val="18"/>
-              </w:rPr>
-              <w:t>/api/webhooks/*</w:t>
-            </w:r>
-            <w:r>
-              <w:rPr>
-                <w:sz w:val="18"/>
-              </w:rPr>
-              <w:t xml:space="preserve">; keep </w:t>
-            </w:r>
-            <w:r>
-              <w:rPr>
-                <w:rFonts w:ascii="Courier New" w:hAnsi="Courier New"/>
-                <w:color w:val="C7254F"/>
-                <w:sz w:val="18"/>
-              </w:rPr>
-              <w:t>/api/health</w:t>
-            </w:r>
-            <w:r>
-              <w:rPr>
-                <w:sz w:val="18"/>
-              </w:rPr>
-              <w:t xml:space="preserve"> open. Test: </w:t>
-            </w:r>
-            <w:r>
-              <w:rPr>
-                <w:rFonts w:ascii="Courier New" w:hAnsi="Courier New"/>
-                <w:color w:val="C7254F"/>
-                <w:sz w:val="18"/>
-              </w:rPr>
-              <w:t>curl /api/messages</w:t>
-            </w:r>
-            <w:r>
-              <w:rPr>
-                <w:sz w:val="18"/>
-              </w:rPr>
-              <w:t xml:space="preserve"> without token → 401.</w:t>
+              <w:t>/health</w:t>
+            </w:r>
+            <w:r>
+              <w:rPr>
+                <w:sz w:val="18"/>
+              </w:rPr>
+              <w:t xml:space="preserve"> stays open.</w:t>
             </w:r>
           </w:p>
         </w:tc>
@@ -1739,7 +1891,7 @@
               <w:rPr>
                 <w:sz w:val="18"/>
               </w:rPr>
-              <w:t>IMPL-PLAN R7</w:t>
+              <w:t>⚠️ YOU MUST DO</w:t>
             </w:r>
           </w:p>
         </w:tc>
@@ -1760,15 +1912,9 @@
             </w:pPr>
             <w:r>
               <w:rPr>
-                <w:b/>
-              </w:rPr>
-              <w:t>YOU MUST DO THIS</w:t>
-            </w:r>
-            <w:r>
-              <w:rPr>
-                <w:sz w:val="18"/>
-              </w:rPr>
-              <w:t xml:space="preserve">: Go to Supabase dashboard → Settings → API → rotate the service-role key. The current key is committed in </w:t>
+                <w:sz w:val="18"/>
+              </w:rPr>
+              <w:t xml:space="preserve">Go to Supabase dashboard → Settings → API → rotate the service-role key. The old key is committed in </w:t>
             </w:r>
             <w:r>
               <w:rPr>
@@ -1782,13 +1928,69 @@
               <w:rPr>
                 <w:sz w:val="18"/>
               </w:rPr>
-              <w:t>. Do NOT run Track C until rotated.</w:t>
+              <w:t>. Do NOT run WF6 until rotated.</w:t>
             </w:r>
           </w:p>
         </w:tc>
       </w:tr>
     </w:tbl>
     <w:p/>
+    <w:p>
+      <w:pPr>
+        <w:ind w:left="576"/>
+      </w:pPr>
+      <w:r>
+        <w:rPr>
+          <w:b/>
+          <w:i/>
+          <w:color w:val="555555"/>
+          <w:sz w:val="19"/>
+        </w:rPr>
+        <w:t>Remaining for today</w:t>
+      </w:r>
+      <w:r>
+        <w:rPr>
+          <w:i/>
+          <w:color w:val="555555"/>
+          <w:sz w:val="19"/>
+        </w:rPr>
+        <w:t xml:space="preserve">: Run </w:t>
+      </w:r>
+      <w:r>
+        <w:rPr>
+          <w:rFonts w:ascii="Courier New" w:hAnsi="Courier New"/>
+          <w:i/>
+          <w:color w:val="555555"/>
+          <w:sz w:val="19"/>
+        </w:rPr>
+        <w:t>supabase db push</w:t>
+      </w:r>
+      <w:r>
+        <w:rPr>
+          <w:i/>
+          <w:color w:val="555555"/>
+          <w:sz w:val="19"/>
+        </w:rPr>
+        <w:t xml:space="preserve"> to apply the two migrations. Verify with </w:t>
+      </w:r>
+      <w:r>
+        <w:rPr>
+          <w:rFonts w:ascii="Courier New" w:hAnsi="Courier New"/>
+          <w:i/>
+          <w:color w:val="555555"/>
+          <w:sz w:val="19"/>
+        </w:rPr>
+        <w:t>SELECT config_key FROM system_config ORDER BY config_key;</w:t>
+      </w:r>
+      <w:r>
+        <w:rPr>
+          <w:i/>
+          <w:color w:val="555555"/>
+          <w:sz w:val="19"/>
+        </w:rPr>
+        <w:t xml:space="preserve"> — expect 15+ rows.</w:t>
+      </w:r>
+    </w:p>
     <w:p>
       <w:r>
         <w:rPr>
@@ -1813,9 +2015,11 @@
       <w:r>
         <w:rPr>
           <w:b/>
+          <w:i/>
+          <w:color w:val="444444"/>
           <w:sz w:val="20"/>
         </w:rPr>
-        <w:t>Goal: AI services implemented in backend</w:t>
+        <w:t>Goal: AI services implemented in backend using Claude Sonnet</w:t>
       </w:r>
     </w:p>
     <w:tbl>
@@ -2030,7 +2234,7 @@
                 <w:color w:val="C7254F"/>
                 <w:sz w:val="18"/>
               </w:rPr>
-              <w:t>npm install openai @pinecone-database/pinecone</w:t>
+              <w:t>npm install @anthropic-ai/sdk</w:t>
             </w:r>
             <w:r>
               <w:rPr>
@@ -2050,7 +2254,7 @@
               <w:rPr>
                 <w:sz w:val="18"/>
               </w:rPr>
-              <w:t xml:space="preserve">. Create </w:t>
+              <w:t xml:space="preserve"> (replaces </w:t>
             </w:r>
             <w:r>
               <w:rPr>
@@ -2058,13 +2262,13 @@
                 <w:color w:val="C7254F"/>
                 <w:sz w:val="18"/>
               </w:rPr>
-              <w:t>backend/src/lib/openai.ts</w:t>
-            </w:r>
-            <w:r>
-              <w:rPr>
-                <w:sz w:val="18"/>
-              </w:rPr>
-              <w:t xml:space="preserve"> (client + model constants). Create </w:t>
+              <w:t>openai</w:t>
+            </w:r>
+            <w:r>
+              <w:rPr>
+                <w:sz w:val="18"/>
+              </w:rPr>
+              <w:t xml:space="preserve"> for LLM). Keep </w:t>
             </w:r>
             <w:r>
               <w:rPr>
@@ -2072,13 +2276,55 @@
                 <w:color w:val="C7254F"/>
                 <w:sz w:val="18"/>
               </w:rPr>
+              <w:t>npm install openai</w:t>
+            </w:r>
+            <w:r>
+              <w:rPr>
+                <w:sz w:val="18"/>
+              </w:rPr>
+              <w:t xml:space="preserve"> for embeddings only. Create </w:t>
+            </w:r>
+            <w:r>
+              <w:rPr>
+                <w:rFonts w:ascii="Courier New" w:hAnsi="Courier New"/>
+                <w:color w:val="C7254F"/>
+                <w:sz w:val="18"/>
+              </w:rPr>
+              <w:t>backend/src/lib/anthropic.ts</w:t>
+            </w:r>
+            <w:r>
+              <w:rPr>
+                <w:sz w:val="18"/>
+              </w:rPr>
+              <w:t xml:space="preserve"> (Anthropic client + model constants). Create </w:t>
+            </w:r>
+            <w:r>
+              <w:rPr>
+                <w:rFonts w:ascii="Courier New" w:hAnsi="Courier New"/>
+                <w:color w:val="C7254F"/>
+                <w:sz w:val="18"/>
+              </w:rPr>
+              <w:t>backend/src/lib/openai.ts</w:t>
+            </w:r>
+            <w:r>
+              <w:rPr>
+                <w:sz w:val="18"/>
+              </w:rPr>
+              <w:t xml:space="preserve"> (OpenAI client for embeddings only — no chat completions). Create </w:t>
+            </w:r>
+            <w:r>
+              <w:rPr>
+                <w:rFonts w:ascii="Courier New" w:hAnsi="Courier New"/>
+                <w:color w:val="C7254F"/>
+                <w:sz w:val="18"/>
+              </w:rPr>
               <w:t>backend/src/lib/pinecone.ts</w:t>
             </w:r>
             <w:r>
               <w:rPr>
                 <w:sz w:val="18"/>
               </w:rPr>
-              <w:t xml:space="preserve"> (client + index). Create </w:t>
+              <w:t xml:space="preserve"> (Pinecone client + index). Create </w:t>
             </w:r>
             <w:r>
               <w:rPr>
@@ -2200,7 +2446,19 @@
               <w:rPr>
                 <w:sz w:val="18"/>
               </w:rPr>
-              <w:t>: fetch message → render P2 prompt → call GPT-4o (</w:t>
+              <w:t xml:space="preserve">: fetch message → render P2 prompt → call </w:t>
+            </w:r>
+            <w:r>
+              <w:rPr>
+                <w:b/>
+              </w:rPr>
+              <w:t>Claude Sonnet</w:t>
+            </w:r>
+            <w:r>
+              <w:rPr>
+                <w:sz w:val="18"/>
+              </w:rPr>
+              <w:t xml:space="preserve"> (</w:t>
             </w:r>
             <w:r>
               <w:rPr>
@@ -2208,13 +2466,13 @@
                 <w:color w:val="C7254F"/>
                 <w:sz w:val="18"/>
               </w:rPr>
-              <w:t>temp: 0.1, max_tokens: 300, response_format: json_object</w:t>
-            </w:r>
-            <w:r>
-              <w:rPr>
-                <w:sz w:val="18"/>
-              </w:rPr>
-              <w:t xml:space="preserve">) → parse + validate with Zod → apply safety overrides (confidence &lt; 0.70 → tier+1, new_inquiry + value/guest → tier 3, cancel/legal keywords → tier 3, unknown sender + tier 1 → tier 2) → update </w:t>
+              <w:t>messages.create</w:t>
+            </w:r>
+            <w:r>
+              <w:rPr>
+                <w:sz w:val="18"/>
+              </w:rPr>
+              <w:t xml:space="preserve">, </w:t>
             </w:r>
             <w:r>
               <w:rPr>
@@ -2222,13 +2480,41 @@
                 <w:color w:val="C7254F"/>
                 <w:sz w:val="18"/>
               </w:rPr>
+              <w:t>max_tokens: 300</w:t>
+            </w:r>
+            <w:r>
+              <w:rPr>
+                <w:sz w:val="18"/>
+              </w:rPr>
+              <w:t xml:space="preserve">) with system: classification_prompt and user: rendered context → parse JSON → apply safety overrides → update </w:t>
+            </w:r>
+            <w:r>
+              <w:rPr>
+                <w:rFonts w:ascii="Courier New" w:hAnsi="Courier New"/>
+                <w:color w:val="C7254F"/>
+                <w:sz w:val="18"/>
+              </w:rPr>
               <w:t>messages</w:t>
             </w:r>
             <w:r>
               <w:rPr>
                 <w:sz w:val="18"/>
               </w:rPr>
-              <w:t xml:space="preserve"> row.</w:t>
+              <w:t xml:space="preserve"> row with </w:t>
+            </w:r>
+            <w:r>
+              <w:rPr>
+                <w:rFonts w:ascii="Courier New" w:hAnsi="Courier New"/>
+                <w:color w:val="C7254F"/>
+                <w:sz w:val="18"/>
+              </w:rPr>
+              <w:t>classification_confidence</w:t>
+            </w:r>
+            <w:r>
+              <w:rPr>
+                <w:sz w:val="18"/>
+              </w:rPr>
+              <w:t>.</w:t>
             </w:r>
           </w:p>
         </w:tc>
@@ -2336,7 +2622,19 @@
               <w:rPr>
                 <w:sz w:val="18"/>
               </w:rPr>
-              <w:t xml:space="preserve">: embed query → Pinecone query with </w:t>
+              <w:t xml:space="preserve">: embed query via </w:t>
+            </w:r>
+            <w:r>
+              <w:rPr>
+                <w:b/>
+              </w:rPr>
+              <w:t>OpenAI text-embedding-3-small</w:t>
+            </w:r>
+            <w:r>
+              <w:rPr>
+                <w:sz w:val="18"/>
+              </w:rPr>
+              <w:t xml:space="preserve"> → Pinecone query with </w:t>
             </w:r>
             <w:r>
               <w:rPr>
@@ -2350,7 +2648,7 @@
               <w:rPr>
                 <w:sz w:val="18"/>
               </w:rPr>
-              <w:t xml:space="preserve"> → hydrate KB rows from Supabase → concatenate context block (max 6000 chars) → return </w:t>
+              <w:t xml:space="preserve"> → hydrate KB rows from Supabase → return </w:t>
             </w:r>
             <w:r>
               <w:rPr>
@@ -2500,7 +2798,7 @@
               <w:rPr>
                 <w:sz w:val="18"/>
               </w:rPr>
-              <w:t xml:space="preserve"> from config, runs regex array), </w:t>
+              <w:t xml:space="preserve"> from config), </w:t>
             </w:r>
             <w:r>
               <w:rPr>
@@ -2514,7 +2812,7 @@
               <w:rPr>
                 <w:sz w:val="18"/>
               </w:rPr>
-              <w:t xml:space="preserve"> (day-name detection, replace non-Mon/Wed with "Monday or Wednesday at your preference (Paris time)"), </w:t>
+              <w:t xml:space="preserve"> (replaces non-Mon/Wed day offers), </w:t>
             </w:r>
             <w:r>
               <w:rPr>
@@ -2528,7 +2826,7 @@
               <w:rPr>
                 <w:sz w:val="18"/>
               </w:rPr>
-              <w:t xml:space="preserve"> (exact-match check).</w:t>
+              <w:t xml:space="preserve"> (exact-match).</w:t>
             </w:r>
           </w:p>
         </w:tc>
@@ -2559,6 +2857,8 @@
       <w:r>
         <w:rPr>
           <w:b/>
+          <w:i/>
+          <w:color w:val="444444"/>
           <w:sz w:val="20"/>
         </w:rPr>
         <w:t>Goal: Draft generator + lead extractor + internal routes</w:t>
@@ -2824,7 +3124,19 @@
               <w:rPr>
                 <w:sz w:val="18"/>
               </w:rPr>
-              <w:t xml:space="preserve"> → retrieve context → build system message from P1 (fill all slots) + user message from P3/P5 → call GPT-4o (</w:t>
+              <w:t xml:space="preserve"> → retrieve context → build system message from P1 (fill all slots) + user message from P3/P5 → call </w:t>
+            </w:r>
+            <w:r>
+              <w:rPr>
+                <w:b/>
+              </w:rPr>
+              <w:t>Claude Sonnet</w:t>
+            </w:r>
+            <w:r>
+              <w:rPr>
+                <w:sz w:val="18"/>
+              </w:rPr>
+              <w:t xml:space="preserve"> (</w:t>
             </w:r>
             <w:r>
               <w:rPr>
@@ -2832,13 +3144,13 @@
                 <w:color w:val="C7254F"/>
                 <w:sz w:val="18"/>
               </w:rPr>
-              <w:t>temp: 0.4, max_tokens: 800</w:t>
-            </w:r>
-            <w:r>
-              <w:rPr>
-                <w:sz w:val="18"/>
-              </w:rPr>
-              <w:t xml:space="preserve">) → run </w:t>
+              <w:t>max_tokens: 1024, temperature: 1</w:t>
+            </w:r>
+            <w:r>
+              <w:rPr>
+                <w:sz w:val="18"/>
+              </w:rPr>
+              <w:t xml:space="preserve"> — Claude uses 0-1 temperature scale) → run </w:t>
             </w:r>
             <w:r>
               <w:rPr>
@@ -2866,91 +3178,19 @@
               <w:rPr>
                 <w:sz w:val="18"/>
               </w:rPr>
-              <w:t xml:space="preserve"> → run P6 tone validator → insert draft with </w:t>
-            </w:r>
-            <w:r>
-              <w:rPr>
-                <w:rFonts w:ascii="Courier New" w:hAnsi="Courier New"/>
-                <w:color w:val="C7254F"/>
-                <w:sz w:val="18"/>
-              </w:rPr>
-              <w:t>sender_persona</w:t>
-            </w:r>
-            <w:r>
-              <w:rPr>
-                <w:sz w:val="18"/>
-              </w:rPr>
-              <w:t xml:space="preserve">, </w:t>
-            </w:r>
-            <w:r>
-              <w:rPr>
-                <w:rFonts w:ascii="Courier New" w:hAnsi="Courier New"/>
-                <w:color w:val="C7254F"/>
-                <w:sz w:val="18"/>
-              </w:rPr>
-              <w:t>sender_email</w:t>
-            </w:r>
-            <w:r>
-              <w:rPr>
-                <w:sz w:val="18"/>
-              </w:rPr>
-              <w:t xml:space="preserve">, </w:t>
-            </w:r>
-            <w:r>
-              <w:rPr>
-                <w:rFonts w:ascii="Courier New" w:hAnsi="Courier New"/>
-                <w:color w:val="C7254F"/>
-                <w:sz w:val="18"/>
-              </w:rPr>
-              <w:t>subject_line</w:t>
-            </w:r>
-            <w:r>
-              <w:rPr>
-                <w:sz w:val="18"/>
-              </w:rPr>
-              <w:t xml:space="preserve">, </w:t>
-            </w:r>
-            <w:r>
-              <w:rPr>
-                <w:rFonts w:ascii="Courier New" w:hAnsi="Courier New"/>
-                <w:color w:val="C7254F"/>
-                <w:sz w:val="18"/>
-              </w:rPr>
-              <w:t>tone_confidence</w:t>
-            </w:r>
-            <w:r>
-              <w:rPr>
-                <w:sz w:val="18"/>
-              </w:rPr>
-              <w:t xml:space="preserve">, </w:t>
-            </w:r>
-            <w:r>
-              <w:rPr>
-                <w:rFonts w:ascii="Courier New" w:hAnsi="Courier New"/>
-                <w:color w:val="C7254F"/>
-                <w:sz w:val="18"/>
-              </w:rPr>
-              <w:t>context_sources</w:t>
-            </w:r>
-            <w:r>
-              <w:rPr>
-                <w:sz w:val="18"/>
-              </w:rPr>
-              <w:t xml:space="preserve">, </w:t>
-            </w:r>
-            <w:r>
-              <w:rPr>
-                <w:rFonts w:ascii="Courier New" w:hAnsi="Courier New"/>
-                <w:color w:val="C7254F"/>
-                <w:sz w:val="18"/>
-              </w:rPr>
-              <w:t>status</w:t>
-            </w:r>
-            <w:r>
-              <w:rPr>
-                <w:sz w:val="18"/>
-              </w:rPr>
-              <w:t>.</w:t>
+              <w:t xml:space="preserve"> → call </w:t>
+            </w:r>
+            <w:r>
+              <w:rPr>
+                <w:b/>
+              </w:rPr>
+              <w:t>Claude Haiku</w:t>
+            </w:r>
+            <w:r>
+              <w:rPr>
+                <w:sz w:val="18"/>
+              </w:rPr>
+              <w:t xml:space="preserve"> for P6 tone validation → insert draft with all fields.</w:t>
             </w:r>
           </w:p>
         </w:tc>
@@ -3058,7 +3298,19 @@
               <w:rPr>
                 <w:sz w:val="18"/>
               </w:rPr>
-              <w:t xml:space="preserve"> (GPT-4o with P4, upsert leads by email, append activity_timeline). Create </w:t>
+              <w:t xml:space="preserve"> (</w:t>
+            </w:r>
+            <w:r>
+              <w:rPr>
+                <w:b/>
+              </w:rPr>
+              <w:t>Claude Sonnet</w:t>
+            </w:r>
+            <w:r>
+              <w:rPr>
+                <w:sz w:val="18"/>
+              </w:rPr>
+              <w:t xml:space="preserve"> with P4, upsert leads by email). Create </w:t>
             </w:r>
             <w:r>
               <w:rPr>
@@ -3076,31 +3328,15 @@
             </w:r>
             <w:r>
               <w:rPr>
-                <w:rFonts w:ascii="Courier New" w:hAnsi="Courier New"/>
-                <w:color w:val="C7254F"/>
-                <w:sz w:val="18"/>
-              </w:rPr>
-              <w:t>embedKbEntry</w:t>
-            </w:r>
-            <w:r>
-              <w:rPr>
-                <w:sz w:val="18"/>
-              </w:rPr>
-              <w:t xml:space="preserve">, </w:t>
-            </w:r>
-            <w:r>
-              <w:rPr>
-                <w:rFonts w:ascii="Courier New" w:hAnsi="Courier New"/>
-                <w:color w:val="C7254F"/>
-                <w:sz w:val="18"/>
-              </w:rPr>
-              <w:t>embedKbBatch</w:t>
-            </w:r>
-            <w:r>
-              <w:rPr>
-                <w:sz w:val="18"/>
-              </w:rPr>
-              <w:t xml:space="preserve"> — embed title+content, upsert to Pinecone with metadata, update </w:t>
+                <w:b/>
+              </w:rPr>
+              <w:t>OpenAI text-embedding-3-small</w:t>
+            </w:r>
+            <w:r>
+              <w:rPr>
+                <w:sz w:val="18"/>
+              </w:rPr>
+              <w:t xml:space="preserve">, upsert to Pinecone, update </w:t>
             </w:r>
             <w:r>
               <w:rPr>
@@ -3348,7 +3584,7 @@
               <w:rPr>
                 <w:sz w:val="18"/>
               </w:rPr>
-              <w:t>. Test each endpoint manually.</w:t>
+              <w:t>.</w:t>
             </w:r>
           </w:p>
         </w:tc>
@@ -3379,6 +3615,8 @@
       <w:r>
         <w:rPr>
           <w:b/>
+          <w:i/>
+          <w:color w:val="444444"/>
           <w:sz w:val="20"/>
         </w:rPr>
         <w:t>Goal: Wire n8n workflows — make the Gmail pipeline actually run end-to-end</w:t>
@@ -3724,21 +3962,7 @@
               <w:rPr>
                 <w:sz w:val="18"/>
               </w:rPr>
-              <w:t xml:space="preserve">: webhook trigger </w:t>
-            </w:r>
-            <w:r>
-              <w:rPr>
-                <w:rFonts w:ascii="Courier New" w:hAnsi="Courier New"/>
-                <w:color w:val="C7254F"/>
-                <w:sz w:val="18"/>
-              </w:rPr>
-              <w:t>POST /webhook/wf2-trigger</w:t>
-            </w:r>
-            <w:r>
-              <w:rPr>
-                <w:sz w:val="18"/>
-              </w:rPr>
-              <w:t xml:space="preserve"> → HTTP call </w:t>
+              <w:t xml:space="preserve">: webhook trigger → HTTP call </w:t>
             </w:r>
             <w:r>
               <w:rPr>
@@ -3902,21 +4126,7 @@
               <w:rPr>
                 <w:sz w:val="18"/>
               </w:rPr>
-              <w:t xml:space="preserve">: webhook </w:t>
-            </w:r>
-            <w:r>
-              <w:rPr>
-                <w:rFonts w:ascii="Courier New" w:hAnsi="Courier New"/>
-                <w:color w:val="C7254F"/>
-                <w:sz w:val="18"/>
-              </w:rPr>
-              <w:t>POST /webhook/wf5-trigger</w:t>
-            </w:r>
-            <w:r>
-              <w:rPr>
-                <w:sz w:val="18"/>
-              </w:rPr>
-              <w:t xml:space="preserve"> → HTTP call </w:t>
+              <w:t xml:space="preserve">: webhook → HTTP call </w:t>
             </w:r>
             <w:r>
               <w:rPr>
@@ -4052,7 +4262,7 @@
               <w:rPr>
                 <w:sz w:val="18"/>
               </w:rPr>
-              <w:t xml:space="preserve">: webhook </w:t>
+              <w:t xml:space="preserve">: webhook → fetch draft+message via </w:t>
             </w:r>
             <w:r>
               <w:rPr>
@@ -4060,13 +4270,13 @@
                 <w:color w:val="C7254F"/>
                 <w:sz w:val="18"/>
               </w:rPr>
-              <w:t>POST /webhook/send-message</w:t>
-            </w:r>
-            <w:r>
-              <w:rPr>
-                <w:sz w:val="18"/>
-              </w:rPr>
-              <w:t xml:space="preserve"> → fetch draft + message via </w:t>
+              <w:t>/api/internal/messages/:id</w:t>
+            </w:r>
+            <w:r>
+              <w:rPr>
+                <w:sz w:val="18"/>
+              </w:rPr>
+              <w:t xml:space="preserve"> → Gmail Send node (from: </w:t>
             </w:r>
             <w:r>
               <w:rPr>
@@ -4074,13 +4284,13 @@
                 <w:color w:val="C7254F"/>
                 <w:sz w:val="18"/>
               </w:rPr>
-              <w:t>/api/internal/messages/:id</w:t>
-            </w:r>
-            <w:r>
-              <w:rPr>
-                <w:sz w:val="18"/>
-              </w:rPr>
-              <w:t xml:space="preserve"> → Gmail Send node (from: </w:t>
+              <w:t>draft.sender_email</w:t>
+            </w:r>
+            <w:r>
+              <w:rPr>
+                <w:sz w:val="18"/>
+              </w:rPr>
+              <w:t xml:space="preserve">, subject: </w:t>
             </w:r>
             <w:r>
               <w:rPr>
@@ -4088,13 +4298,13 @@
                 <w:color w:val="C7254F"/>
                 <w:sz w:val="18"/>
               </w:rPr>
-              <w:t>draft.sender_email</w:t>
-            </w:r>
-            <w:r>
-              <w:rPr>
-                <w:sz w:val="18"/>
-              </w:rPr>
-              <w:t xml:space="preserve">, subject: </w:t>
+              <w:t>draft.subject_line</w:t>
+            </w:r>
+            <w:r>
+              <w:rPr>
+                <w:sz w:val="18"/>
+              </w:rPr>
+              <w:t xml:space="preserve">, body: </w:t>
             </w:r>
             <w:r>
               <w:rPr>
@@ -4102,13 +4312,13 @@
                 <w:color w:val="C7254F"/>
                 <w:sz w:val="18"/>
               </w:rPr>
-              <w:t>draft.subject_line</w:t>
-            </w:r>
-            <w:r>
-              <w:rPr>
-                <w:sz w:val="18"/>
-              </w:rPr>
-              <w:t xml:space="preserve">, body: </w:t>
+              <w:t>draft.draft_text</w:t>
+            </w:r>
+            <w:r>
+              <w:rPr>
+                <w:sz w:val="18"/>
+              </w:rPr>
+              <w:t xml:space="preserve">, In-Reply-To + thread, CC if present) → apply label </w:t>
             </w:r>
             <w:r>
               <w:rPr>
@@ -4116,13 +4326,13 @@
                 <w:color w:val="C7254F"/>
                 <w:sz w:val="18"/>
               </w:rPr>
-              <w:t>draft.draft_text</w:t>
-            </w:r>
-            <w:r>
-              <w:rPr>
-                <w:sz w:val="18"/>
-              </w:rPr>
-              <w:t xml:space="preserve">, In-Reply-To + thread, CC if present) → apply label </w:t>
+              <w:t>AI-Sent</w:t>
+            </w:r>
+            <w:r>
+              <w:rPr>
+                <w:sz w:val="18"/>
+              </w:rPr>
+              <w:t xml:space="preserve">, remove </w:t>
             </w:r>
             <w:r>
               <w:rPr>
@@ -4130,13 +4340,13 @@
                 <w:color w:val="C7254F"/>
                 <w:sz w:val="18"/>
               </w:rPr>
-              <w:t>AI-Sent</w:t>
-            </w:r>
-            <w:r>
-              <w:rPr>
-                <w:sz w:val="18"/>
-              </w:rPr>
-              <w:t xml:space="preserve">, remove </w:t>
+              <w:t>AI-Processing</w:t>
+            </w:r>
+            <w:r>
+              <w:rPr>
+                <w:sz w:val="18"/>
+              </w:rPr>
+              <w:t xml:space="preserve"> → 3 retries with exponential backoff → HTTP callback </w:t>
             </w:r>
             <w:r>
               <w:rPr>
@@ -4144,13 +4354,13 @@
                 <w:color w:val="C7254F"/>
                 <w:sz w:val="18"/>
               </w:rPr>
-              <w:t>AI-Processing</w:t>
-            </w:r>
-            <w:r>
-              <w:rPr>
-                <w:sz w:val="18"/>
-              </w:rPr>
-              <w:t xml:space="preserve"> → 3 retries with exponential backoff → HTTP callback </w:t>
+              <w:t>POST /api/webhooks/n8n/send-result</w:t>
+            </w:r>
+            <w:r>
+              <w:rPr>
+                <w:sz w:val="18"/>
+              </w:rPr>
+              <w:t xml:space="preserve"> with HMAC signature. WhatsApp/Instagram: stub </w:t>
             </w:r>
             <w:r>
               <w:rPr>
@@ -4158,27 +4368,13 @@
                 <w:color w:val="C7254F"/>
                 <w:sz w:val="18"/>
               </w:rPr>
-              <w:t>POST /api/webhooks/n8n/send-result</w:t>
-            </w:r>
-            <w:r>
-              <w:rPr>
-                <w:sz w:val="18"/>
-              </w:rPr>
-              <w:t xml:space="preserve"> with HMAC signature. WhatsApp/Instagram branches: stub with </w:t>
-            </w:r>
-            <w:r>
-              <w:rPr>
-                <w:rFonts w:ascii="Courier New" w:hAnsi="Courier New"/>
-                <w:color w:val="C7254F"/>
-                <w:sz w:val="18"/>
-              </w:rPr>
               <w:t>send_failed</w:t>
             </w:r>
             <w:r>
               <w:rPr>
                 <w:sz w:val="18"/>
               </w:rPr>
-              <w:t xml:space="preserve"> error (Meta pending).</w:t>
+              <w:t>.</w:t>
             </w:r>
           </w:p>
         </w:tc>
@@ -4286,7 +4482,7 @@
               <w:rPr>
                 <w:sz w:val="18"/>
               </w:rPr>
-              <w:t xml:space="preserve">. WF8: webhook </w:t>
+              <w:t xml:space="preserve">. WF8: webhook → </w:t>
             </w:r>
             <w:r>
               <w:rPr>
@@ -4294,27 +4490,13 @@
                 <w:color w:val="C7254F"/>
                 <w:sz w:val="18"/>
               </w:rPr>
-              <w:t>POST /webhook/draft-action</w:t>
-            </w:r>
-            <w:r>
-              <w:rPr>
-                <w:sz w:val="18"/>
-              </w:rPr>
-              <w:t xml:space="preserve"> → </w:t>
-            </w:r>
-            <w:r>
-              <w:rPr>
-                <w:rFonts w:ascii="Courier New" w:hAnsi="Courier New"/>
-                <w:color w:val="C7254F"/>
-                <w:sz w:val="18"/>
-              </w:rPr>
               <w:t>POST /api/internal/dashboard-action</w:t>
             </w:r>
             <w:r>
               <w:rPr>
                 <w:sz w:val="18"/>
               </w:rPr>
-              <w:t xml:space="preserve"> (dispatches by action).</w:t>
+              <w:t>.</w:t>
             </w:r>
           </w:p>
         </w:tc>
@@ -4345,6 +4527,8 @@
       <w:r>
         <w:rPr>
           <w:b/>
+          <w:i/>
+          <w:color w:val="444444"/>
           <w:sz w:val="20"/>
         </w:rPr>
         <w:t>Goal: Dashboard UX wired + KB seeded + smoke test</w:t>
@@ -4596,7 +4780,7 @@
               <w:rPr>
                 <w:sz w:val="18"/>
               </w:rPr>
-              <w:t xml:space="preserve"> (Supabase session JWT).</w:t>
+              <w:t>.</w:t>
             </w:r>
           </w:p>
         </w:tc>
@@ -4704,7 +4888,7 @@
               <w:rPr>
                 <w:sz w:val="18"/>
               </w:rPr>
-              <w:t xml:space="preserve"> (textarea + submit → </w:t>
+              <w:t xml:space="preserve"> and </w:t>
             </w:r>
             <w:r>
               <w:rPr>
@@ -4712,41 +4896,13 @@
                 <w:color w:val="C7254F"/>
                 <w:sz w:val="18"/>
               </w:rPr>
-              <w:t>POST /api/drafts/:id/regenerate</w:t>
-            </w:r>
-            <w:r>
-              <w:rPr>
-                <w:sz w:val="18"/>
-              </w:rPr>
-              <w:t xml:space="preserve">). Create </w:t>
-            </w:r>
-            <w:r>
-              <w:rPr>
-                <w:rFonts w:ascii="Courier New" w:hAnsi="Courier New"/>
-                <w:color w:val="C7254F"/>
-                <w:sz w:val="18"/>
-              </w:rPr>
-              <w:t>dashboard/components/RejectModal.tsx</w:t>
-            </w:r>
-            <w:r>
-              <w:rPr>
-                <w:sz w:val="18"/>
-              </w:rPr>
-              <w:t xml:space="preserve"> (reason dropdown + textarea → </w:t>
-            </w:r>
-            <w:r>
-              <w:rPr>
-                <w:rFonts w:ascii="Courier New" w:hAnsi="Courier New"/>
-                <w:color w:val="C7254F"/>
-                <w:sz w:val="18"/>
-              </w:rPr>
-              <w:t>POST /api/drafts/:id/reject</w:t>
-            </w:r>
-            <w:r>
-              <w:rPr>
-                <w:sz w:val="18"/>
-              </w:rPr>
-              <w:t xml:space="preserve">). Wire both into </w:t>
+              <w:t>RejectModal.tsx</w:t>
+            </w:r>
+            <w:r>
+              <w:rPr>
+                <w:sz w:val="18"/>
+              </w:rPr>
+              <w:t xml:space="preserve">. Wire into </w:t>
             </w:r>
             <w:r>
               <w:rPr>
@@ -4868,7 +5024,7 @@
               <w:rPr>
                 <w:sz w:val="18"/>
               </w:rPr>
-              <w:t xml:space="preserve"> (reads </w:t>
+              <w:t xml:space="preserve">. Create 15+ KB markdown files. Run script → verify </w:t>
             </w:r>
             <w:r>
               <w:rPr>
@@ -4876,125 +5032,13 @@
                 <w:color w:val="C7254F"/>
                 <w:sz w:val="18"/>
               </w:rPr>
-              <w:t>knowledge-base/**/*.md</w:t>
-            </w:r>
-            <w:r>
-              <w:rPr>
-                <w:sz w:val="18"/>
-              </w:rPr>
-              <w:t xml:space="preserve">, parses YAML frontmatter, upserts to Supabase, calls </w:t>
-            </w:r>
-            <w:r>
-              <w:rPr>
-                <w:rFonts w:ascii="Courier New" w:hAnsi="Courier New"/>
-                <w:color w:val="C7254F"/>
-                <w:sz w:val="18"/>
-              </w:rPr>
-              <w:t>/api/internal/embed-kb</w:t>
-            </w:r>
-            <w:r>
-              <w:rPr>
-                <w:sz w:val="18"/>
-              </w:rPr>
-              <w:t xml:space="preserve">). Create minimum 15 KB files across </w:t>
-            </w:r>
-            <w:r>
-              <w:rPr>
-                <w:rFonts w:ascii="Courier New" w:hAnsi="Courier New"/>
-                <w:color w:val="C7254F"/>
-                <w:sz w:val="18"/>
-              </w:rPr>
-              <w:t>brand-voice/</w:t>
-            </w:r>
-            <w:r>
-              <w:rPr>
-                <w:sz w:val="18"/>
-              </w:rPr>
-              <w:t xml:space="preserve">, </w:t>
-            </w:r>
-            <w:r>
-              <w:rPr>
-                <w:rFonts w:ascii="Courier New" w:hAnsi="Courier New"/>
-                <w:color w:val="C7254F"/>
-                <w:sz w:val="18"/>
-              </w:rPr>
-              <w:t>email-examples/</w:t>
-            </w:r>
-            <w:r>
-              <w:rPr>
-                <w:sz w:val="18"/>
-              </w:rPr>
-              <w:t xml:space="preserve">, </w:t>
-            </w:r>
-            <w:r>
-              <w:rPr>
-                <w:rFonts w:ascii="Courier New" w:hAnsi="Courier New"/>
-                <w:color w:val="C7254F"/>
-                <w:sz w:val="18"/>
-              </w:rPr>
-              <w:t>templates/</w:t>
-            </w:r>
-            <w:r>
-              <w:rPr>
-                <w:sz w:val="18"/>
-              </w:rPr>
-              <w:t xml:space="preserve">, </w:t>
-            </w:r>
-            <w:r>
-              <w:rPr>
-                <w:rFonts w:ascii="Courier New" w:hAnsi="Courier New"/>
-                <w:color w:val="C7254F"/>
-                <w:sz w:val="18"/>
-              </w:rPr>
-              <w:t>faqs/</w:t>
-            </w:r>
-            <w:r>
-              <w:rPr>
-                <w:sz w:val="18"/>
-              </w:rPr>
-              <w:t xml:space="preserve">, </w:t>
-            </w:r>
-            <w:r>
-              <w:rPr>
-                <w:rFonts w:ascii="Courier New" w:hAnsi="Courier New"/>
-                <w:color w:val="C7254F"/>
-                <w:sz w:val="18"/>
-              </w:rPr>
-              <w:t>qualification/</w:t>
-            </w:r>
-            <w:r>
-              <w:rPr>
-                <w:sz w:val="18"/>
-              </w:rPr>
-              <w:t xml:space="preserve"> folders — extract from </w:t>
-            </w:r>
-            <w:r>
-              <w:rPr>
-                <w:rFonts w:ascii="Courier New" w:hAnsi="Courier New"/>
-                <w:color w:val="C7254F"/>
-                <w:sz w:val="18"/>
-              </w:rPr>
-              <w:t>graphify-out/converted/Ai Brain Date and Core Report*.md</w:t>
-            </w:r>
-            <w:r>
-              <w:rPr>
-                <w:sz w:val="18"/>
-              </w:rPr>
-              <w:t xml:space="preserve">. Run script → verify </w:t>
-            </w:r>
-            <w:r>
-              <w:rPr>
-                <w:rFonts w:ascii="Courier New" w:hAnsi="Courier New"/>
-                <w:color w:val="C7254F"/>
-                <w:sz w:val="18"/>
-              </w:rPr>
               <w:t>embedding_status='embedded'</w:t>
             </w:r>
             <w:r>
               <w:rPr>
                 <w:sz w:val="18"/>
               </w:rPr>
-              <w:t xml:space="preserve"> on all.</w:t>
+              <w:t xml:space="preserve"> on all via OpenAI embeddings.</w:t>
             </w:r>
           </w:p>
         </w:tc>
@@ -5088,21 +5132,7 @@
               <w:rPr>
                 <w:sz w:val="18"/>
               </w:rPr>
-              <w:t xml:space="preserve">Send a real test email to the DPW Gmail inbox. Verify within 90 seconds: message appears in </w:t>
-            </w:r>
-            <w:r>
-              <w:rPr>
-                <w:rFonts w:ascii="Courier New" w:hAnsi="Courier New"/>
-                <w:color w:val="C7254F"/>
-                <w:sz w:val="18"/>
-              </w:rPr>
-              <w:t>messages</w:t>
-            </w:r>
-            <w:r>
-              <w:rPr>
-                <w:sz w:val="18"/>
-              </w:rPr>
-              <w:t xml:space="preserve"> table → classified → draft generated with correct sender persona, no commission language → dashboard shows draft → approve → reply lands in original Gmail thread with correct subject + signature + </w:t>
+              <w:t xml:space="preserve">Send real test email → verify within 90s: ingested → classified by Claude → draft generated with correct persona → approve in dashboard → reply sent in Gmail thread with </w:t>
             </w:r>
             <w:r>
               <w:rPr>
@@ -5147,6 +5177,8 @@
       <w:r>
         <w:rPr>
           <w:b/>
+          <w:i/>
+          <w:color w:val="444444"/>
           <w:sz w:val="20"/>
         </w:rPr>
         <w:t>Goal: Buffer, fixes, UAT</w:t>
@@ -5307,7 +5339,7 @@
               <w:rPr>
                 <w:sz w:val="18"/>
               </w:rPr>
-              <w:t>Investigate any failures in the Day 5 smoke test. Common failure points: OAuth token expiry on Gmail, Pinecone empty results (check dimension = 1536 and metadata stored as string), dashboard auth header missing, WF1 JWT not rotated.</w:t>
+              <w:t>Common points: OAuth token expiry, Pinecone empty results (check 1536 dim + string metadata), dashboard auth header, JWT not rotated.</w:t>
             </w:r>
           </w:p>
         </w:tc>
@@ -5378,7 +5410,7 @@
               <w:rPr>
                 <w:sz w:val="18"/>
               </w:rPr>
-              <w:t xml:space="preserve">Confirm: no Supabase JWT in any committed file, </w:t>
+              <w:t xml:space="preserve">No Supabase JWT in committed files; </w:t>
             </w:r>
             <w:r>
               <w:rPr>
@@ -5392,21 +5424,7 @@
               <w:rPr>
                 <w:sz w:val="18"/>
               </w:rPr>
-              <w:t xml:space="preserve"> key not in </w:t>
-            </w:r>
-            <w:r>
-              <w:rPr>
-                <w:rFonts w:ascii="Courier New" w:hAnsi="Courier New"/>
-                <w:color w:val="C7254F"/>
-                <w:sz w:val="18"/>
-              </w:rPr>
-              <w:t>dashboard/</w:t>
-            </w:r>
-            <w:r>
-              <w:rPr>
-                <w:sz w:val="18"/>
-              </w:rPr>
-              <w:t xml:space="preserve"> code, HMAC enforced on all webhooks, JWT enforced on all backend routes.</w:t>
+              <w:t xml:space="preserve"> not in dashboard code; HMAC on all webhooks; JWT on all backend routes.</w:t>
             </w:r>
           </w:p>
         </w:tc>
@@ -5477,7 +5495,7 @@
               <w:rPr>
                 <w:sz w:val="18"/>
               </w:rPr>
-              <w:t>Run 3 different email scenarios through the full pipeline: (a) new inquiry from unknown sender, (b) vendor communication, (c) general question. Verify correct tier, sender persona, and draft quality each time.</w:t>
+              <w:t>3 scenarios: (a) new inquiry from unknown sender, (b) vendor communication, (c) general question. Verify tier, sender persona, draft quality.</w:t>
             </w:r>
           </w:p>
         </w:tc>
@@ -5520,17 +5538,17 @@
           <w:color w:val="2D2D2D"/>
           <w:sz w:val="17"/>
         </w:rPr>
-        <w:t>Day 1:  Task 1 (drift) → Task 2 (migrations+seed) → Task 3 (auth) → ⚠️ Rotate JWT (manual)</w:t>
+        <w:t>Day 1 ✅:  Task 1 (drift) → Task 2 (migrations+seed) → Task 3 (auth) → ⚠️ Rotate JWT (manual)</w:t>
         <w:br/>
-        <w:t>Day 2:  Task 5-libs → Task 6-classifier → Task 7-retrieval → Task 8-sanitizers</w:t>
+        <w:t>Day 2:     Task 5-libs(Anthropic+OpenAI) → Task 6-classifier(Claude) → Task 7-retrieval(OpenAI embed) → Task 8-sanitizers</w:t>
         <w:br/>
-        <w:t>Day 3:  Task 9-draftGenerator → Task 10-leadExtractor+embedder → Task 11-internal routes</w:t>
+        <w:t>Day 3:     Task 9-draftGenerator(Claude) → Task 10-leadExtractor+embedder → Task 11-internal routes</w:t>
         <w:br/>
-        <w:t>Day 4:  Task 12-WF1 fix → Task 13-WF2 → Task 14-WF5 → Task 15-WF6 Gmail → Task 16-WF7/8</w:t>
+        <w:t>Day 4:     Task 12-WF1 fix → Task 13-WF2 → Task 14-WF5 → Task 15-WF6 Gmail → Task 16-WF7/8</w:t>
         <w:br/>
-        <w:t>Day 5:  Task 17-dashboard auth → Task 18-modals → Task 19-KB pipeline → Task 20-smoke test</w:t>
+        <w:t>Day 5:     Task 17-dashboard auth → Task 18-modals → Task 19-KB pipeline → Task 20-smoke test</w:t>
         <w:br/>
-        <w:t>Day 6:  Fix bugs → Security check → UAT</w:t>
+        <w:t>Day 6:     Fix bugs → Security check → UAT</w:t>
       </w:r>
     </w:p>
     <w:p>
@@ -5804,7 +5822,7 @@
               <w:rPr>
                 <w:sz w:val="18"/>
               </w:rPr>
-              <w:t>Audit log viewer page (Task 8)</w:t>
+              <w:t>Voyage AI embeddings (replace OpenAI)</w:t>
             </w:r>
           </w:p>
         </w:tc>
@@ -5827,7 +5845,7 @@
               <w:rPr>
                 <w:sz w:val="18"/>
               </w:rPr>
-              <w:t>Not blocking Gmail workflow</w:t>
+              <w:t>Optional migration</w:t>
             </w:r>
           </w:p>
         </w:tc>
@@ -5850,7 +5868,7 @@
               <w:rPr>
                 <w:sz w:val="18"/>
               </w:rPr>
-              <w:t>Week 6</w:t>
+              <w:t>Future sprint if desired</w:t>
             </w:r>
           </w:p>
         </w:tc>
@@ -5875,7 +5893,7 @@
               <w:rPr>
                 <w:sz w:val="18"/>
               </w:rPr>
-              <w:t>Analytics page (Task 8)</w:t>
+              <w:t>Audit log viewer page (Task 8)</w:t>
             </w:r>
           </w:p>
         </w:tc>
@@ -5946,7 +5964,7 @@
               <w:rPr>
                 <w:sz w:val="18"/>
               </w:rPr>
-              <w:t>Bulk inbox actions (Task 9)</w:t>
+              <w:t>Analytics page (Task 8)</w:t>
             </w:r>
           </w:p>
         </w:tc>
@@ -6017,7 +6035,7 @@
               <w:rPr>
                 <w:sz w:val="18"/>
               </w:rPr>
-              <w:t>150+ KB entries</w:t>
+              <w:t>Bulk inbox actions (Task 9)</w:t>
             </w:r>
           </w:p>
         </w:tc>
@@ -6040,7 +6058,7 @@
               <w:rPr>
                 <w:sz w:val="18"/>
               </w:rPr>
-              <w:t>Sophie/Audrey content delivery</w:t>
+              <w:t>Not blocking Gmail workflow</w:t>
             </w:r>
           </w:p>
         </w:tc>
@@ -6054,6 +6072,77 @@
               <w:right w:val="single" w:sz="4" w:color="DDDDDD"/>
             </w:tcBorders>
             <w:shd w:val="clear" w:color="auto" w:fill="FFFFFF"/>
+          </w:tcPr>
+          <w:p>
+            <w:pPr>
+              <w:spacing w:before="40" w:after="40"/>
+            </w:pPr>
+            <w:r>
+              <w:rPr>
+                <w:sz w:val="18"/>
+              </w:rPr>
+              <w:t>Week 6</w:t>
+            </w:r>
+          </w:p>
+        </w:tc>
+      </w:tr>
+      <w:tr>
+        <w:tc>
+          <w:tcPr>
+            <w:tcW w:type="dxa" w:w="3135"/>
+            <w:tcBorders>
+              <w:top w:val="single" w:sz="4" w:color="DDDDDD"/>
+              <w:left w:val="single" w:sz="4" w:color="DDDDDD"/>
+              <w:bottom w:val="single" w:sz="4" w:color="DDDDDD"/>
+              <w:right w:val="single" w:sz="4" w:color="DDDDDD"/>
+            </w:tcBorders>
+            <w:shd w:val="clear" w:color="auto" w:fill="FAFAF8"/>
+          </w:tcPr>
+          <w:p>
+            <w:pPr>
+              <w:spacing w:before="40" w:after="40"/>
+            </w:pPr>
+            <w:r>
+              <w:rPr>
+                <w:sz w:val="18"/>
+              </w:rPr>
+              <w:t>150+ KB entries</w:t>
+            </w:r>
+          </w:p>
+        </w:tc>
+        <w:tc>
+          <w:tcPr>
+            <w:tcW w:type="dxa" w:w="3135"/>
+            <w:tcBorders>
+              <w:top w:val="single" w:sz="4" w:color="DDDDDD"/>
+              <w:left w:val="single" w:sz="4" w:color="DDDDDD"/>
+              <w:bottom w:val="single" w:sz="4" w:color="DDDDDD"/>
+              <w:right w:val="single" w:sz="4" w:color="DDDDDD"/>
+            </w:tcBorders>
+            <w:shd w:val="clear" w:color="auto" w:fill="FAFAF8"/>
+          </w:tcPr>
+          <w:p>
+            <w:pPr>
+              <w:spacing w:before="40" w:after="40"/>
+            </w:pPr>
+            <w:r>
+              <w:rPr>
+                <w:sz w:val="18"/>
+              </w:rPr>
+              <w:t>Sophie/Audrey content delivery</w:t>
+            </w:r>
+          </w:p>
+        </w:tc>
+        <w:tc>
+          <w:tcPr>
+            <w:tcW w:type="dxa" w:w="3135"/>
+            <w:tcBorders>
+              <w:top w:val="single" w:sz="4" w:color="DDDDDD"/>
+              <w:left w:val="single" w:sz="4" w:color="DDDDDD"/>
+              <w:bottom w:val="single" w:sz="4" w:color="DDDDDD"/>
+              <w:right w:val="single" w:sz="4" w:color="DDDDDD"/>
+            </w:tcBorders>
+            <w:shd w:val="clear" w:color="auto" w:fill="FAFAF8"/>
           </w:tcPr>
           <w:p>
             <w:pPr>
@@ -6221,7 +6310,7 @@
               <w:rPr>
                 <w:sz w:val="18"/>
               </w:rPr>
-              <w:t>Pinecone empty results</w:t>
+              <w:t>Claude API rate limits</w:t>
             </w:r>
           </w:p>
         </w:tc>
@@ -6244,35 +6333,7 @@
               <w:rPr>
                 <w:sz w:val="18"/>
               </w:rPr>
-              <w:t xml:space="preserve">Confirm index dimension = 1536, </w:t>
-            </w:r>
-            <w:r>
-              <w:rPr>
-                <w:rFonts w:ascii="Courier New" w:hAnsi="Courier New"/>
-                <w:color w:val="C7254F"/>
-                <w:sz w:val="18"/>
-              </w:rPr>
-              <w:t>category</w:t>
-            </w:r>
-            <w:r>
-              <w:rPr>
-                <w:sz w:val="18"/>
-              </w:rPr>
-              <w:t xml:space="preserve"> metadata stored as string (not array), filter uses </w:t>
-            </w:r>
-            <w:r>
-              <w:rPr>
-                <w:rFonts w:ascii="Courier New" w:hAnsi="Courier New"/>
-                <w:color w:val="C7254F"/>
-                <w:sz w:val="18"/>
-              </w:rPr>
-              <w:t>$in</w:t>
-            </w:r>
-            <w:r>
-              <w:rPr>
-                <w:sz w:val="18"/>
-              </w:rPr>
-              <w:t xml:space="preserve"> operator.</w:t>
+              <w:t>claude-sonnet-4-6 has generous limits. Use claude-haiku-4-5-20251001 for tone validation to reduce cost/latency.</w:t>
             </w:r>
           </w:p>
         </w:tc>
@@ -6297,7 +6358,7 @@
               <w:rPr>
                 <w:sz w:val="18"/>
               </w:rPr>
-              <w:t>GPT-4o returns malformed JSON</w:t>
+              <w:t>Pinecone empty results</w:t>
             </w:r>
           </w:p>
         </w:tc>
@@ -6320,7 +6381,7 @@
               <w:rPr>
                 <w:sz w:val="18"/>
               </w:rPr>
-              <w:t xml:space="preserve">Use </w:t>
+              <w:t xml:space="preserve">Confirm index dimension = 1536 (matches text-embedding-3-small), </w:t>
             </w:r>
             <w:r>
               <w:rPr>
@@ -6328,13 +6389,27 @@
                 <w:color w:val="C7254F"/>
                 <w:sz w:val="18"/>
               </w:rPr>
-              <w:t>response_format: { type: 'json_object' }</w:t>
-            </w:r>
-            <w:r>
-              <w:rPr>
-                <w:sz w:val="18"/>
-              </w:rPr>
-              <w:t>. Retry once with "Return ONLY valid JSON, no preamble" if still fails.</w:t>
+              <w:t>category</w:t>
+            </w:r>
+            <w:r>
+              <w:rPr>
+                <w:sz w:val="18"/>
+              </w:rPr>
+              <w:t xml:space="preserve"> metadata stored as string, filter uses </w:t>
+            </w:r>
+            <w:r>
+              <w:rPr>
+                <w:rFonts w:ascii="Courier New" w:hAnsi="Courier New"/>
+                <w:color w:val="C7254F"/>
+                <w:sz w:val="18"/>
+              </w:rPr>
+              <w:t>$in</w:t>
+            </w:r>
+            <w:r>
+              <w:rPr>
+                <w:sz w:val="18"/>
+              </w:rPr>
+              <w:t xml:space="preserve"> operator.</w:t>
             </w:r>
           </w:p>
         </w:tc>
@@ -6359,7 +6434,7 @@
               <w:rPr>
                 <w:sz w:val="18"/>
               </w:rPr>
-              <w:t>Dashboard 401 after auth middleware added</w:t>
+              <w:t>Claude returns non-JSON for classification/extraction</w:t>
             </w:r>
           </w:p>
         </w:tc>
@@ -6382,35 +6457,7 @@
               <w:rPr>
                 <w:sz w:val="18"/>
               </w:rPr>
-              <w:t xml:space="preserve">Update every </w:t>
-            </w:r>
-            <w:r>
-              <w:rPr>
-                <w:rFonts w:ascii="Courier New" w:hAnsi="Courier New"/>
-                <w:color w:val="C7254F"/>
-                <w:sz w:val="18"/>
-              </w:rPr>
-              <w:t>fetch(BACKEND_URL + ...)</w:t>
-            </w:r>
-            <w:r>
-              <w:rPr>
-                <w:sz w:val="18"/>
-              </w:rPr>
-              <w:t xml:space="preserve"> call in dashboard to send </w:t>
-            </w:r>
-            <w:r>
-              <w:rPr>
-                <w:rFonts w:ascii="Courier New" w:hAnsi="Courier New"/>
-                <w:color w:val="C7254F"/>
-                <w:sz w:val="18"/>
-              </w:rPr>
-              <w:t>Authorization: Bearer &lt;session.access_token&gt;</w:t>
-            </w:r>
-            <w:r>
-              <w:rPr>
-                <w:sz w:val="18"/>
-              </w:rPr>
-              <w:t>.</w:t>
+              <w:t>Use a JSON-enforcing system prompt suffix: "Return ONLY valid JSON, no preamble, no markdown fences." Retry once if parse fails.</w:t>
             </w:r>
           </w:p>
         </w:tc>
@@ -6435,7 +6482,7 @@
               <w:rPr>
                 <w:sz w:val="18"/>
               </w:rPr>
-              <w:t>Gmail OAuth token expired</w:t>
+              <w:t>Dashboard 401 after auth middleware added</w:t>
             </w:r>
           </w:p>
         </w:tc>
@@ -6449,6 +6496,82 @@
               <w:right w:val="single" w:sz="4" w:color="DDDDDD"/>
             </w:tcBorders>
             <w:shd w:val="clear" w:color="auto" w:fill="FAFAF8"/>
+          </w:tcPr>
+          <w:p>
+            <w:pPr>
+              <w:spacing w:before="40" w:after="40"/>
+            </w:pPr>
+            <w:r>
+              <w:rPr>
+                <w:sz w:val="18"/>
+              </w:rPr>
+              <w:t xml:space="preserve">Update every </w:t>
+            </w:r>
+            <w:r>
+              <w:rPr>
+                <w:rFonts w:ascii="Courier New" w:hAnsi="Courier New"/>
+                <w:color w:val="C7254F"/>
+                <w:sz w:val="18"/>
+              </w:rPr>
+              <w:t>fetch(BACKEND_URL + ...)</w:t>
+            </w:r>
+            <w:r>
+              <w:rPr>
+                <w:sz w:val="18"/>
+              </w:rPr>
+              <w:t xml:space="preserve"> in dashboard to send </w:t>
+            </w:r>
+            <w:r>
+              <w:rPr>
+                <w:rFonts w:ascii="Courier New" w:hAnsi="Courier New"/>
+                <w:color w:val="C7254F"/>
+                <w:sz w:val="18"/>
+              </w:rPr>
+              <w:t>Authorization: Bearer &lt;session.access_token&gt;</w:t>
+            </w:r>
+            <w:r>
+              <w:rPr>
+                <w:sz w:val="18"/>
+              </w:rPr>
+              <w:t>.</w:t>
+            </w:r>
+          </w:p>
+        </w:tc>
+      </w:tr>
+      <w:tr>
+        <w:tc>
+          <w:tcPr>
+            <w:tcW w:type="dxa" w:w="4703"/>
+            <w:tcBorders>
+              <w:top w:val="single" w:sz="4" w:color="DDDDDD"/>
+              <w:left w:val="single" w:sz="4" w:color="DDDDDD"/>
+              <w:bottom w:val="single" w:sz="4" w:color="DDDDDD"/>
+              <w:right w:val="single" w:sz="4" w:color="DDDDDD"/>
+            </w:tcBorders>
+            <w:shd w:val="clear" w:color="auto" w:fill="FFFFFF"/>
+          </w:tcPr>
+          <w:p>
+            <w:pPr>
+              <w:spacing w:before="40" w:after="40"/>
+            </w:pPr>
+            <w:r>
+              <w:rPr>
+                <w:sz w:val="18"/>
+              </w:rPr>
+              <w:t>Gmail OAuth token expired</w:t>
+            </w:r>
+          </w:p>
+        </w:tc>
+        <w:tc>
+          <w:tcPr>
+            <w:tcW w:type="dxa" w:w="4703"/>
+            <w:tcBorders>
+              <w:top w:val="single" w:sz="4" w:color="DDDDDD"/>
+              <w:left w:val="single" w:sz="4" w:color="DDDDDD"/>
+              <w:bottom w:val="single" w:sz="4" w:color="DDDDDD"/>
+              <w:right w:val="single" w:sz="4" w:color="DDDDDD"/>
+            </w:tcBorders>
+            <w:shd w:val="clear" w:color="auto" w:fill="FFFFFF"/>
           </w:tcPr>
           <w:p>
             <w:pPr>

</xml_diff>